<commit_message>
docs: regenerate project handbook DOCX to reflect recent chemical property removals
</commit_message>
<xml_diff>
--- a/docs/PBMS-Project-Handbook.docx
+++ b/docs/PBMS-Project-Handbook.docx
@@ -434,7 +434,7 @@
         <w:t xml:space="preserve"> </w:t>
       </w:r>
       <w:r>
-        <w:t xml:space="preserve">— with technical properties (CAS number, molecular formula, purity, etc.)</w:t>
+        <w:t xml:space="preserve">— with technical properties (CAS number, UN number, etc.)</w:t>
       </w:r>
     </w:p>
     <w:p>
@@ -5320,7 +5320,7 @@
               <w:pStyle w:val="Compact"/>
             </w:pPr>
             <w:r>
-              <w:t xml:space="preserve">molecular_formula</w:t>
+              <w:t xml:space="preserve">shelf_life</w:t>
             </w:r>
           </w:p>
         </w:tc>
@@ -5342,150 +5342,10 @@
               <w:pStyle w:val="Compact"/>
             </w:pPr>
             <w:r>
-              <w:t xml:space="preserve">e.g. H2O</w:t>
-            </w:r>
-          </w:p>
-        </w:tc>
-      </w:tr>
-      <w:tr>
-        <w:tc>
-          <w:tcPr/>
-          <w:p>
-            <w:pPr>
-              <w:pStyle w:val="Compact"/>
-            </w:pPr>
-            <w:r>
-              <w:t xml:space="preserve">molecular_weight</w:t>
-            </w:r>
-          </w:p>
-        </w:tc>
-        <w:tc>
-          <w:tcPr/>
-          <w:p>
-            <w:pPr>
-              <w:pStyle w:val="Compact"/>
-            </w:pPr>
-            <w:r>
-              <w:t xml:space="preserve">Decimal?</w:t>
-            </w:r>
-          </w:p>
-        </w:tc>
-        <w:tc>
-          <w:tcPr/>
-          <w:p>
-            <w:pPr>
-              <w:pStyle w:val="Compact"/>
-            </w:pPr>
-            <w:r>
-              <w:t xml:space="preserve">Decimal(10,4)</w:t>
-            </w:r>
-          </w:p>
-        </w:tc>
-      </w:tr>
-      <w:tr>
-        <w:tc>
-          <w:tcPr/>
-          <w:p>
-            <w:pPr>
-              <w:pStyle w:val="Compact"/>
-            </w:pPr>
-            <w:r>
-              <w:t xml:space="preserve">purity</w:t>
-            </w:r>
-          </w:p>
-        </w:tc>
-        <w:tc>
-          <w:tcPr/>
-          <w:p>
-            <w:pPr>
-              <w:pStyle w:val="Compact"/>
-            </w:pPr>
-            <w:r>
-              <w:t xml:space="preserve">Decimal?</w:t>
-            </w:r>
-          </w:p>
-        </w:tc>
-        <w:tc>
-          <w:tcPr/>
-          <w:p>
-            <w:pPr>
-              <w:pStyle w:val="Compact"/>
-            </w:pPr>
-            <w:r>
-              <w:t xml:space="preserve">Decimal(5,2)</w:t>
-            </w:r>
-          </w:p>
-        </w:tc>
-      </w:tr>
-      <w:tr>
-        <w:tc>
-          <w:tcPr/>
-          <w:p>
-            <w:pPr>
-              <w:pStyle w:val="Compact"/>
-            </w:pPr>
-            <w:r>
-              <w:t xml:space="preserve">shelf_life</w:t>
-            </w:r>
-          </w:p>
-        </w:tc>
-        <w:tc>
-          <w:tcPr/>
-          <w:p>
-            <w:pPr>
-              <w:pStyle w:val="Compact"/>
-            </w:pPr>
-            <w:r>
-              <w:t xml:space="preserve">String?</w:t>
-            </w:r>
-          </w:p>
-        </w:tc>
-        <w:tc>
-          <w:tcPr/>
-          <w:p>
-            <w:pPr>
-              <w:pStyle w:val="Compact"/>
-            </w:pPr>
-            <w:r>
               <w:t xml:space="preserve">e.g. </w:t>
             </w:r>
             <w:r>
               <w:t xml:space="preserve">“24 months”</w:t>
-            </w:r>
-          </w:p>
-        </w:tc>
-      </w:tr>
-      <w:tr>
-        <w:tc>
-          <w:tcPr/>
-          <w:p>
-            <w:pPr>
-              <w:pStyle w:val="Compact"/>
-            </w:pPr>
-            <w:r>
-              <w:t xml:space="preserve">process_type</w:t>
-            </w:r>
-          </w:p>
-        </w:tc>
-        <w:tc>
-          <w:tcPr/>
-          <w:p>
-            <w:pPr>
-              <w:pStyle w:val="Compact"/>
-            </w:pPr>
-            <w:r>
-              <w:t xml:space="preserve">String?</w:t>
-            </w:r>
-          </w:p>
-        </w:tc>
-        <w:tc>
-          <w:tcPr/>
-          <w:p>
-            <w:pPr>
-              <w:pStyle w:val="Compact"/>
-            </w:pPr>
-            <w:r>
-              <w:t xml:space="preserve">Manufacturing process</w:t>
             </w:r>
           </w:p>
         </w:tc>

</xml_diff>